<commit_message>
Corrections en-tête, adhésion, définition + courriel du domaine
- Sigle du logo en anglais (NBPAC) selon la langue; bandeau
  « Association professionnelle » (FR/EN); juridiction « N.-B. / N.B. »
- Bouton secondaire du hero rendu lisible sur fond foncé
- Adhésion : stage supervisé d'au moins 540 heures dans le domaine
  (ou équivalent), site + politique + guide
- Définition du criminologue élargie : appui aux forces de l'ordre,
  criminalité corporative illicite, modus operandi, méthodes
  stratégique/opérationnel/tactique
- Courriel info@apcnb.ca remplacé par info@apcnb-nbpac.ca
- Word et PDF régénérés + ZIP reconstruit

Co-Authored-By: Claude Opus 4.8 <noreply@anthropic.com>
</commit_message>
<xml_diff>
--- a/telechargements/word-en/13-Champ-exercice-Scope-of-Practice.docx
+++ b/telechargements/word-en/13-Champ-exercice-Scope-of-Practice.docx
@@ -150,6 +150,14 @@
       </w:r>
       <w:r>
         <w:t xml:space="preserve">, and applies that knowledge to prevention, to the assessment and support of people in contact with justice, to the design and evaluation of programs, and to research and policy advice. Their distinctive lens is crime and justice, not the clinical treatment of mental health.</w:t>
+      </w:r>
+    </w:p>
+    <w:p>
+      <w:pPr>
+        <w:spacing w:after="140"/>
+      </w:pPr>
+      <w:r>
+        <w:t xml:space="preserve">The criminologist may also practise in other ways within the field of criminology: in support of law enforcement, they study the behavioural patterns of individuals and groups engaged in lucrative or corporate activities deemed illicit, analyze their operational and transactional movements to establish the modus operandi, and develop intervention methods at the strategic, operational and tactical levels.</w:t>
       </w:r>
     </w:p>
     <w:p>
@@ -865,7 +873,7 @@
         <w:sz w:val="15"/>
         <w:szCs w:val="15"/>
       </w:rPr>
-      <w:t xml:space="preserve">C.P. 0000, Fredericton (Nouveau-Brunswick) E3B 0A0   ·   info@apcnb.ca   ·   </w:t>
+      <w:t xml:space="preserve">C.P. 0000, Fredericton (Nouveau-Brunswick) E3B 0A0   ·   info@apcnb-nbpac.ca   ·   </w:t>
     </w:r>
     <w:r>
       <w:rPr>

</xml_diff>

<commit_message>
Accompagnement psychosocial non clinique au champ d'exercice
- Ajout de l'accompagnement psychosocial non clinique (soutien,
  orientation vers les ressources, développement du pouvoir d'agir,
  sans diagnostic ni traitement de santé mentale) : page « Le
  criminologue » et document Champ d'exercice (FR + EN)
- Nouveau domaine « Accompagnement psychosocial (non clinique) » au
  bottin, ajouté à la fiche de Christian Chendjou
- Word/PDF régénérés; ZIP public reconstruit (sans modèles internes)

Co-Authored-By: Claude Opus 4.8 <noreply@anthropic.com>
</commit_message>
<xml_diff>
--- a/telechargements/word-en/13-Champ-exercice-Scope-of-Practice.docx
+++ b/telechargements/word-en/13-Champ-exercice-Scope-of-Practice.docx
@@ -245,6 +245,19 @@
       </w:pPr>
       <w:r>
         <w:t xml:space="preserve">Support the social reintegration of people who have offended.</w:t>
+      </w:r>
+    </w:p>
+    <w:p>
+      <w:pPr>
+        <w:pStyle w:val="ListParagraph"/>
+        <w:numPr>
+          <w:ilvl w:val="0"/>
+          <w:numId w:val="2"/>
+        </w:numPr>
+        <w:spacing w:after="60"/>
+      </w:pPr>
+      <w:r>
+        <w:t xml:space="preserve">Provide non-clinical psychosocial support (help within the social environment, referral to resources, empowerment), without diagnosis or mental-health treatment.</w:t>
       </w:r>
     </w:p>
     <w:p>

</xml_diff>